<commit_message>
Tester guide: add task 14, multi-city trip with hotels
Co-Authored-By: Claude Opus 5.5 <noreply@anthropic.com>
Claude-Session: https://claude.ai/code/session_01Dn7Xhc2GHkpg7xEnaWgx65
</commit_message>
<xml_diff>
--- a/PassageIQ-Tester-Guide.docx
+++ b/PassageIQ-Tester-Guide.docx
@@ -329,7 +329,7 @@
     <w:p>
       <w:pPr/>
       <w:r>
-        <w:t xml:space="preserve">Work through these 13 tasks in order; each takes 1 to 4 minutes. Type the example requests exactly as shown, then try your own wording too.</w:t>
+        <w:t xml:space="preserve">Work through these 14 tasks in order; each takes 1 to 5 minutes. Type the example requests exactly as shown, then try your own wording too.</w:t>
       </w:r>
     </w:p>
     <w:p>
@@ -684,7 +684,7 @@
         </w:numPr>
       </w:pPr>
       <w:r>
-        <w:t xml:space="preserve">Choose a flight (and a hotel if offered).</w:t>
+        <w:t xml:space="preserve">Choose a flight. If your trip includes a hotel, choose one on the next screen.</w:t>
       </w:r>
     </w:p>
     <w:p>
@@ -989,6 +989,149 @@
       <w:pPr/>
       <w:r>
         <w:t xml:space="preserve">Check: Is everything readable and easy to tap? Did anything look broken or cut off?</w:t>
+      </w:r>
+    </w:p>
+    <w:p>
+      <w:pPr>
+        <w:pStyle w:val="Heading3"/>
+      </w:pPr>
+      <w:r>
+        <w:t xml:space="preserve">14. A trip with several cities and hotels</w:t>
+      </w:r>
+    </w:p>
+    <w:p>
+      <w:pPr>
+        <w:pStyle w:val="ListParagraph"/>
+        <w:numPr>
+          <w:ilvl w:val="0"/>
+          <w:numId w:val="16"/>
+        </w:numPr>
+      </w:pPr>
+      <w:r>
+        <w:t xml:space="preserve">Tap </w:t>
+      </w:r>
+      <w:r>
+        <w:rPr>
+          <w:b/>
+        </w:rPr>
+        <w:t xml:space="preserve">Start over</w:t>
+      </w:r>
+      <w:r>
+        <w:t xml:space="preserve"> on the Search page, then type: </w:t>
+      </w:r>
+      <w:r>
+        <w:rPr>
+          <w:i/>
+        </w:rPr>
+        <w:t xml:space="preserve">Next Saturday to Las Vegas for 3 days, then Detroit for 5 days and back home, hotels in each city</w:t>
+      </w:r>
+    </w:p>
+    <w:p>
+      <w:pPr>
+        <w:pStyle w:val="ListParagraph"/>
+        <w:numPr>
+          <w:ilvl w:val="0"/>
+          <w:numId w:val="16"/>
+        </w:numPr>
+      </w:pPr>
+      <w:r>
+        <w:t xml:space="preserve">Check </w:t>
+      </w:r>
+      <w:r>
+        <w:rPr>
+          <w:b/>
+        </w:rPr>
+        <w:t xml:space="preserve">Your trip plan</w:t>
+      </w:r>
+      <w:r>
+        <w:t xml:space="preserve">: the flight dates, the nights in each city and the hotel boxes. Try </w:t>
+      </w:r>
+      <w:r>
+        <w:rPr>
+          <w:b/>
+        </w:rPr>
+        <w:t xml:space="preserve">+</w:t>
+      </w:r>
+      <w:r>
+        <w:t xml:space="preserve"> on one city's nights and </w:t>
+      </w:r>
+      <w:r>
+        <w:rPr>
+          <w:b/>
+        </w:rPr>
+        <w:t xml:space="preserve">+1 week</w:t>
+      </w:r>
+      <w:r>
+        <w:t xml:space="preserve">, and watch the dates move.</w:t>
+      </w:r>
+    </w:p>
+    <w:p>
+      <w:pPr>
+        <w:pStyle w:val="ListParagraph"/>
+        <w:numPr>
+          <w:ilvl w:val="0"/>
+          <w:numId w:val="16"/>
+        </w:numPr>
+      </w:pPr>
+      <w:r>
+        <w:t xml:space="preserve">Tap </w:t>
+      </w:r>
+      <w:r>
+        <w:rPr>
+          <w:b/>
+        </w:rPr>
+        <w:t xml:space="preserve">Search flights first</w:t>
+      </w:r>
+      <w:r>
+        <w:t xml:space="preserve"> and choose flights.</w:t>
+      </w:r>
+    </w:p>
+    <w:p>
+      <w:pPr>
+        <w:pStyle w:val="ListParagraph"/>
+        <w:numPr>
+          <w:ilvl w:val="0"/>
+          <w:numId w:val="16"/>
+        </w:numPr>
+      </w:pPr>
+      <w:r>
+        <w:t xml:space="preserve">On </w:t>
+      </w:r>
+      <w:r>
+        <w:rPr>
+          <w:b/>
+        </w:rPr>
+        <w:t xml:space="preserve">Now choose your hotels</w:t>
+      </w:r>
+      <w:r>
+        <w:t xml:space="preserve">, pick a hotel in one city and </w:t>
+      </w:r>
+      <w:r>
+        <w:rPr>
+          <w:b/>
+        </w:rPr>
+        <w:t xml:space="preserve">No hotel needed</w:t>
+      </w:r>
+      <w:r>
+        <w:t xml:space="preserve"> in the other, then continue to review.</w:t>
+      </w:r>
+    </w:p>
+    <w:p>
+      <w:pPr>
+        <w:pStyle w:val="ListParagraph"/>
+        <w:numPr>
+          <w:ilvl w:val="0"/>
+          <w:numId w:val="16"/>
+        </w:numPr>
+      </w:pPr>
+      <w:r>
+        <w:t xml:space="preserve">Try it again in your own words, for a trip you might really take.</w:t>
+      </w:r>
+    </w:p>
+    <w:p>
+      <w:pPr/>
+      <w:r>
+        <w:t xml:space="preserve">Check: Were the dates and nights right? Was it clear that hotels come after flights? Is the total for flights plus hotels easy to understand?</w:t>
       </w:r>
     </w:p>
     <w:p>
@@ -1601,6 +1744,49 @@
             <w:pPr/>
             <w:r>
               <w:t xml:space="preserve">On your phone</w:t>
+            </w:r>
+          </w:p>
+        </w:tc>
+        <w:tc>
+          <w:tcPr>
+            <w:tcW w:w="1634" w:type="dxa"/>
+          </w:tcPr>
+          <w:p>
+            <w:pPr/>
+            <w:r>
+              <w:t xml:space="preserve">[Result]</w:t>
+            </w:r>
+          </w:p>
+        </w:tc>
+        <w:tc>
+          <w:tcPr>
+            <w:tcW w:w="1269" w:type="dxa"/>
+          </w:tcPr>
+          <w:p>
+            <w:pPr/>
+          </w:p>
+        </w:tc>
+      </w:tr>
+      <w:tr>
+        <w:tc>
+          <w:tcPr>
+            <w:tcW w:w="1102" w:type="dxa"/>
+          </w:tcPr>
+          <w:p>
+            <w:pPr/>
+            <w:r>
+              <w:t xml:space="preserve">14</w:t>
+            </w:r>
+          </w:p>
+        </w:tc>
+        <w:tc>
+          <w:tcPr>
+            <w:tcW w:w="5353" w:type="dxa"/>
+          </w:tcPr>
+          <w:p>
+            <w:pPr/>
+            <w:r>
+              <w:t xml:space="preserve">Several cities and hotels</w:t>
             </w:r>
           </w:p>
         </w:tc>
@@ -3087,6 +3273,12 @@
     </w:lvlOverride>
   </w:num>
   <w:num w:numId="15">
+    <w:abstractNumId w:val="1"/>
+    <w:lvlOverride w:ilvl="0">
+      <w:startOverride w:val="1"/>
+    </w:lvlOverride>
+  </w:num>
+  <w:num w:numId="16">
     <w:abstractNumId w:val="1"/>
     <w:lvlOverride w:ilvl="0">
       <w:startOverride w:val="1"/>

</xml_diff>